<commit_message>
Usunięte pole I.Z.P.G — duplikat numeru roboty
Okazało się, że I.Z.P.G to ten sam numer co „Nr roboty”, więc wpisywanie go
dwa razy było proszeniem się o rozjazd między jednym a drugim. Pole znika
z formularza i ze wzoru szablonu.

Po usunięciu trzeciego pola w pierwszym rzędzie zostałaby dziura na jedną
kolumnę siatki, więc numer roboty i numer operatu dostają po pół szerokości —
tak jak daty w rzędzie niżej.

Co-Authored-By: Claude Opus 5 <noreply@anthropic.com>
</commit_message>
<xml_diff>
--- a/szablony/spis_tresci_wzor.docx
+++ b/szablony/spis_tresci_wzor.docx
@@ -52,19 +52,6 @@
           <w:sz w:val="24"/>
         </w:rPr>
         <w:t>Nr operatu: {{ nr_operatu }}</w:t>
-      </w:r>
-    </w:p>
-    <w:p>
-      <w:pPr>
-        <w:spacing w:before="0"/>
-        <w:jc w:val="center"/>
-      </w:pPr>
-      <w:r>
-        <w:rPr>
-          <w:b w:val="0"/>
-          <w:sz w:val="24"/>
-        </w:rPr>
-        <w:t>I.Z.P.G: {{ izpg }}</w:t>
       </w:r>
     </w:p>
     <w:p>

</xml_diff>

<commit_message>
Spis treści jak lista: tabulator, wcięcie wiszące i większe odstępy
Numery i tekst rozjeżdżały się, bo między nimi była zwykła spacja — „1.” i „13.”
mają różną szerokość, więc każda pozycja zaczynała się gdzie indziej. Zamiast
tego tabulator z przystankiem na 0,9 cm i wcięcie wiszące o tę samą wartość:
tekst zawsze startuje w tym samym miejscu, a zawinięta pozycja trzyma się tekstu,
zamiast chować się pod numerem. Odstęp po akapicie 6 pt rozsuwa wiersze.

Przy okazji akapit spisu dostaje wyrównanie do lewej. Dziedziczył justowanie
ze stylu i zawinięta pozycja rozciągała się na całą szerokość, robiąc dziury
między słowami.

Poprawianie operatu odświeża też ścieżki w historii. Gdy ktoś skasuje katalog
z Eksploratora, poprawka zakłada go od nowa — a wpis wskazywał wtedy stary,
nieistniejący folder i „Otwórz katalog” oraz „Złóż PDF” prowadziły donikąd.

Co-Authored-By: Claude Opus 5 <noreply@anthropic.com>
</commit_message>
<xml_diff>
--- a/szablony/spis_tresci_wzor.docx
+++ b/szablony/spis_tresci_wzor.docx
@@ -109,7 +109,25 @@
           <w:b/>
           <w:sz w:val="20"/>
         </w:rPr>
-        <w:t>{{ data_zakonczenia }}</w:t>
+        <w:t xml:space="preserve">{{ </w:t>
+      </w:r>
+      <w:proofErr w:type="spellStart"/>
+      <w:r>
+        <w:rPr>
+          <w:rFonts w:ascii="Bahnschrift SemiBold" w:eastAsia="Cupertino" w:hAnsi="Bahnschrift SemiBold" w:cs="Arial"/>
+          <w:b/>
+          <w:sz w:val="20"/>
+        </w:rPr>
+        <w:t>data_zakonczenia</w:t>
+      </w:r>
+      <w:proofErr w:type="spellEnd"/>
+      <w:r>
+        <w:rPr>
+          <w:rFonts w:ascii="Bahnschrift SemiBold" w:eastAsia="Cupertino" w:hAnsi="Bahnschrift SemiBold" w:cs="Arial"/>
+          <w:b/>
+          <w:sz w:val="20"/>
+        </w:rPr>
+        <w:t xml:space="preserve"> }}</w:t>
       </w:r>
     </w:p>
     <w:p>
@@ -155,7 +173,16 @@
           <w:b/>
           <w:sz w:val="20"/>
         </w:rPr>
-        <w:t>{{ nr_</w:t>
+        <w:t xml:space="preserve">{{ </w:t>
+      </w:r>
+      <w:proofErr w:type="spellStart"/>
+      <w:r>
+        <w:rPr>
+          <w:rFonts w:ascii="Bahnschrift SemiBold" w:hAnsi="Bahnschrift SemiBold" w:cs="Arial"/>
+          <w:b/>
+          <w:sz w:val="20"/>
+        </w:rPr>
+        <w:t>nr_</w:t>
       </w:r>
       <w:r>
         <w:rPr>
@@ -165,6 +192,7 @@
         </w:rPr>
         <w:t>operatu</w:t>
       </w:r>
+      <w:proofErr w:type="spellEnd"/>
       <w:r>
         <w:rPr>
           <w:rFonts w:ascii="Bahnschrift SemiBold" w:hAnsi="Bahnschrift SemiBold" w:cs="Arial"/>
@@ -213,6 +241,7 @@
         </w:rPr>
         <w:t xml:space="preserve">{{ </w:t>
       </w:r>
+      <w:proofErr w:type="spellStart"/>
       <w:r>
         <w:rPr>
           <w:rFonts w:ascii="Bahnschrift SemiBold" w:hAnsi="Bahnschrift SemiBold" w:cs="Arial"/>
@@ -231,6 +260,7 @@
         </w:rPr>
         <w:t>roboty</w:t>
       </w:r>
+      <w:proofErr w:type="spellEnd"/>
       <w:r>
         <w:rPr>
           <w:rFonts w:ascii="Bahnschrift SemiBold" w:hAnsi="Bahnschrift SemiBold" w:cs="Arial"/>
@@ -359,7 +389,25 @@
           <w:b/>
           <w:sz w:val="20"/>
         </w:rPr>
-        <w:t>Jedn. ewid.</w:t>
+        <w:t xml:space="preserve">Jedn. </w:t>
+      </w:r>
+      <w:proofErr w:type="spellStart"/>
+      <w:r>
+        <w:rPr>
+          <w:rFonts w:ascii="Bahnschrift SemiBold" w:eastAsia="Cupertino" w:hAnsi="Bahnschrift SemiBold" w:cs="Arial"/>
+          <w:b/>
+          <w:sz w:val="20"/>
+        </w:rPr>
+        <w:t>ewid</w:t>
+      </w:r>
+      <w:proofErr w:type="spellEnd"/>
+      <w:r>
+        <w:rPr>
+          <w:rFonts w:ascii="Bahnschrift SemiBold" w:eastAsia="Cupertino" w:hAnsi="Bahnschrift SemiBold" w:cs="Arial"/>
+          <w:b/>
+          <w:sz w:val="20"/>
+        </w:rPr>
+        <w:t>.</w:t>
       </w:r>
       <w:r>
         <w:rPr>
@@ -399,7 +447,25 @@
           <w:b/>
           <w:sz w:val="20"/>
         </w:rPr>
-        <w:t>{{ polozenie_gmina_teryt }}</w:t>
+        <w:t xml:space="preserve">{{ </w:t>
+      </w:r>
+      <w:proofErr w:type="spellStart"/>
+      <w:r>
+        <w:rPr>
+          <w:rFonts w:ascii="Bahnschrift SemiBold" w:eastAsia="Cupertino" w:hAnsi="Bahnschrift SemiBold" w:cs="Arial"/>
+          <w:b/>
+          <w:sz w:val="20"/>
+        </w:rPr>
+        <w:t>polozenie_gmina_teryt</w:t>
+      </w:r>
+      <w:proofErr w:type="spellEnd"/>
+      <w:r>
+        <w:rPr>
+          <w:rFonts w:ascii="Bahnschrift SemiBold" w:eastAsia="Cupertino" w:hAnsi="Bahnschrift SemiBold" w:cs="Arial"/>
+          <w:b/>
+          <w:sz w:val="20"/>
+        </w:rPr>
+        <w:t xml:space="preserve"> }}</w:t>
       </w:r>
       <w:r>
         <w:rPr>
@@ -415,7 +481,25 @@
           <w:b/>
           <w:sz w:val="20"/>
         </w:rPr>
-        <w:t xml:space="preserve"> {{ polozenie_gmina }}</w:t>
+        <w:t xml:space="preserve"> {{ </w:t>
+      </w:r>
+      <w:proofErr w:type="spellStart"/>
+      <w:r>
+        <w:rPr>
+          <w:rFonts w:ascii="Bahnschrift SemiBold" w:eastAsia="Cupertino" w:hAnsi="Bahnschrift SemiBold" w:cs="Arial"/>
+          <w:b/>
+          <w:sz w:val="20"/>
+        </w:rPr>
+        <w:t>polozenie_gmina</w:t>
+      </w:r>
+      <w:proofErr w:type="spellEnd"/>
+      <w:r>
+        <w:rPr>
+          <w:rFonts w:ascii="Bahnschrift SemiBold" w:eastAsia="Cupertino" w:hAnsi="Bahnschrift SemiBold" w:cs="Arial"/>
+          <w:b/>
+          <w:sz w:val="20"/>
+        </w:rPr>
+        <w:t xml:space="preserve"> }}</w:t>
       </w:r>
     </w:p>
     <w:p>
@@ -435,7 +519,25 @@
           <w:b/>
           <w:sz w:val="20"/>
         </w:rPr>
-        <w:t>Obręb ewid.:</w:t>
+        <w:t xml:space="preserve">Obręb </w:t>
+      </w:r>
+      <w:proofErr w:type="spellStart"/>
+      <w:r>
+        <w:rPr>
+          <w:rFonts w:ascii="Bahnschrift SemiBold" w:eastAsia="Cupertino" w:hAnsi="Bahnschrift SemiBold" w:cs="Arial"/>
+          <w:b/>
+          <w:sz w:val="20"/>
+        </w:rPr>
+        <w:t>ewid</w:t>
+      </w:r>
+      <w:proofErr w:type="spellEnd"/>
+      <w:r>
+        <w:rPr>
+          <w:rFonts w:ascii="Bahnschrift SemiBold" w:eastAsia="Cupertino" w:hAnsi="Bahnschrift SemiBold" w:cs="Arial"/>
+          <w:b/>
+          <w:sz w:val="20"/>
+        </w:rPr>
+        <w:t>.:</w:t>
       </w:r>
       <w:r>
         <w:rPr>
@@ -467,7 +569,25 @@
           <w:b/>
           <w:sz w:val="20"/>
         </w:rPr>
-        <w:t>{{ polozenie_obreb_teryt }}</w:t>
+        <w:t xml:space="preserve">{{ </w:t>
+      </w:r>
+      <w:proofErr w:type="spellStart"/>
+      <w:r>
+        <w:rPr>
+          <w:rFonts w:ascii="Bahnschrift SemiBold" w:eastAsia="Cupertino" w:hAnsi="Bahnschrift SemiBold" w:cs="Arial"/>
+          <w:b/>
+          <w:sz w:val="20"/>
+        </w:rPr>
+        <w:t>polozenie_obreb_teryt</w:t>
+      </w:r>
+      <w:proofErr w:type="spellEnd"/>
+      <w:r>
+        <w:rPr>
+          <w:rFonts w:ascii="Bahnschrift SemiBold" w:eastAsia="Cupertino" w:hAnsi="Bahnschrift SemiBold" w:cs="Arial"/>
+          <w:b/>
+          <w:sz w:val="20"/>
+        </w:rPr>
+        <w:t xml:space="preserve"> }}</w:t>
       </w:r>
       <w:r>
         <w:rPr>
@@ -483,7 +603,25 @@
           <w:b/>
           <w:sz w:val="20"/>
         </w:rPr>
-        <w:t>{{ polozenie_obreb }}</w:t>
+        <w:t xml:space="preserve">{{ </w:t>
+      </w:r>
+      <w:proofErr w:type="spellStart"/>
+      <w:r>
+        <w:rPr>
+          <w:rFonts w:ascii="Bahnschrift SemiBold" w:eastAsia="Cupertino" w:hAnsi="Bahnschrift SemiBold" w:cs="Arial"/>
+          <w:b/>
+          <w:sz w:val="20"/>
+        </w:rPr>
+        <w:t>polozenie_obreb</w:t>
+      </w:r>
+      <w:proofErr w:type="spellEnd"/>
+      <w:r>
+        <w:rPr>
+          <w:rFonts w:ascii="Bahnschrift SemiBold" w:eastAsia="Cupertino" w:hAnsi="Bahnschrift SemiBold" w:cs="Arial"/>
+          <w:b/>
+          <w:sz w:val="20"/>
+        </w:rPr>
+        <w:t xml:space="preserve"> }}</w:t>
       </w:r>
     </w:p>
     <w:p>
@@ -527,7 +665,25 @@
           <w:b/>
           <w:sz w:val="20"/>
         </w:rPr>
-        <w:t>{{ nr_dzialki }}</w:t>
+        <w:t xml:space="preserve">{{ </w:t>
+      </w:r>
+      <w:proofErr w:type="spellStart"/>
+      <w:r>
+        <w:rPr>
+          <w:rFonts w:ascii="Bahnschrift SemiBold" w:eastAsia="Cupertino" w:hAnsi="Bahnschrift SemiBold" w:cs="Arial"/>
+          <w:b/>
+          <w:sz w:val="20"/>
+        </w:rPr>
+        <w:t>nr_dzialki</w:t>
+      </w:r>
+      <w:proofErr w:type="spellEnd"/>
+      <w:r>
+        <w:rPr>
+          <w:rFonts w:ascii="Bahnschrift SemiBold" w:eastAsia="Cupertino" w:hAnsi="Bahnschrift SemiBold" w:cs="Arial"/>
+          <w:b/>
+          <w:sz w:val="20"/>
+        </w:rPr>
+        <w:t xml:space="preserve"> }}</w:t>
       </w:r>
     </w:p>
     <w:p>
@@ -577,8 +733,8 @@
         <w:rPr>
           <w:rFonts w:ascii="Bahnschrift SemiBold" w:hAnsi="Bahnschrift SemiBold" w:cs="Arial"/>
           <w:b/>
-          <w:sz w:val="24"/>
-          <w:szCs w:val="24"/>
+          <w:sz w:val="32"/>
+          <w:szCs w:val="32"/>
           <w:u w:val="single"/>
         </w:rPr>
       </w:pPr>
@@ -586,11 +742,33 @@
         <w:rPr>
           <w:rFonts w:ascii="Bahnschrift SemiBold" w:hAnsi="Bahnschrift SemiBold" w:cs="Arial"/>
           <w:b/>
-          <w:sz w:val="24"/>
-          <w:szCs w:val="24"/>
+          <w:sz w:val="32"/>
+          <w:szCs w:val="32"/>
           <w:u w:val="single"/>
         </w:rPr>
-        <w:t>{{ rodzaj_pracy }}</w:t>
+        <w:t xml:space="preserve">{{ </w:t>
+      </w:r>
+      <w:proofErr w:type="spellStart"/>
+      <w:r>
+        <w:rPr>
+          <w:rFonts w:ascii="Bahnschrift SemiBold" w:hAnsi="Bahnschrift SemiBold" w:cs="Arial"/>
+          <w:b/>
+          <w:sz w:val="32"/>
+          <w:szCs w:val="32"/>
+          <w:u w:val="single"/>
+        </w:rPr>
+        <w:t>rodzaj_pracy</w:t>
+      </w:r>
+      <w:proofErr w:type="spellEnd"/>
+      <w:r>
+        <w:rPr>
+          <w:rFonts w:ascii="Bahnschrift SemiBold" w:hAnsi="Bahnschrift SemiBold" w:cs="Arial"/>
+          <w:b/>
+          <w:sz w:val="32"/>
+          <w:szCs w:val="32"/>
+          <w:u w:val="single"/>
+        </w:rPr>
+        <w:t xml:space="preserve"> }}</w:t>
       </w:r>
     </w:p>
     <w:p>
@@ -642,6 +820,7 @@
           <w:lang w:val="en-US"/>
         </w:rPr>
       </w:pPr>
+      <w:proofErr w:type="spellStart"/>
       <w:r>
         <w:rPr>
           <w:rFonts w:ascii="Bahnschrift SemiBold" w:eastAsia="Cupertino" w:hAnsi="Bahnschrift SemiBold" w:cs="Arial"/>
@@ -651,8 +830,9 @@
           <w:szCs w:val="28"/>
           <w:lang w:val="en-US"/>
         </w:rPr>
-        <w:t xml:space="preserve">Spis </w:t>
-      </w:r>
+        <w:t>Spis</w:t>
+      </w:r>
+      <w:proofErr w:type="spellEnd"/>
       <w:r>
         <w:rPr>
           <w:rFonts w:ascii="Bahnschrift SemiBold" w:eastAsia="Cupertino" w:hAnsi="Bahnschrift SemiBold" w:cs="Arial"/>
@@ -662,8 +842,21 @@
           <w:szCs w:val="28"/>
           <w:lang w:val="en-US"/>
         </w:rPr>
+        <w:t xml:space="preserve"> </w:t>
+      </w:r>
+      <w:proofErr w:type="spellStart"/>
+      <w:r>
+        <w:rPr>
+          <w:rFonts w:ascii="Bahnschrift SemiBold" w:eastAsia="Cupertino" w:hAnsi="Bahnschrift SemiBold" w:cs="Arial"/>
+          <w:b/>
+          <w:bCs/>
+          <w:sz w:val="28"/>
+          <w:szCs w:val="28"/>
+          <w:lang w:val="en-US"/>
+        </w:rPr>
         <w:t>treści</w:t>
       </w:r>
+      <w:proofErr w:type="spellEnd"/>
     </w:p>
     <w:p>
       <w:pPr>
@@ -700,12 +893,54 @@
           <w:sz w:val="20"/>
           <w:lang w:val="en-US"/>
         </w:rPr>
-        <w:t>{%p for pozycja in spis_tresci %}</w:t>
+        <w:t xml:space="preserve">{%p for </w:t>
+      </w:r>
+      <w:proofErr w:type="spellStart"/>
+      <w:r>
+        <w:rPr>
+          <w:rFonts w:ascii="Bahnschrift SemiBold" w:hAnsi="Bahnschrift SemiBold" w:cs="Arial"/>
+          <w:sz w:val="20"/>
+          <w:lang w:val="en-US"/>
+        </w:rPr>
+        <w:t>pozycja</w:t>
+      </w:r>
+      <w:proofErr w:type="spellEnd"/>
+      <w:r>
+        <w:rPr>
+          <w:rFonts w:ascii="Bahnschrift SemiBold" w:hAnsi="Bahnschrift SemiBold" w:cs="Arial"/>
+          <w:sz w:val="20"/>
+          <w:lang w:val="en-US"/>
+        </w:rPr>
+        <w:t xml:space="preserve"> in </w:t>
+      </w:r>
+      <w:proofErr w:type="spellStart"/>
+      <w:r>
+        <w:rPr>
+          <w:rFonts w:ascii="Bahnschrift SemiBold" w:hAnsi="Bahnschrift SemiBold" w:cs="Arial"/>
+          <w:sz w:val="20"/>
+          <w:lang w:val="en-US"/>
+        </w:rPr>
+        <w:t>spis_tresci</w:t>
+      </w:r>
+      <w:proofErr w:type="spellEnd"/>
+      <w:r>
+        <w:rPr>
+          <w:rFonts w:ascii="Bahnschrift SemiBold" w:hAnsi="Bahnschrift SemiBold" w:cs="Arial"/>
+          <w:sz w:val="20"/>
+          <w:lang w:val="en-US"/>
+        </w:rPr>
+        <w:t xml:space="preserve"> %}</w:t>
       </w:r>
     </w:p>
     <w:p>
       <w:pPr>
         <w:pStyle w:val="Bezodstpw"/>
+        <w:tabs>
+          <w:tab w:pos="510" w:val="left"/>
+        </w:tabs>
+        <w:spacing w:after="120"/>
+        <w:ind w:left="510" w:hanging="510"/>
+        <w:jc w:val="left"/>
         <w:rPr>
           <w:rFonts w:ascii="Bahnschrift SemiBold" w:hAnsi="Bahnschrift SemiBold" w:cs="Arial"/>
           <w:sz w:val="20"/>
@@ -718,7 +953,45 @@
           <w:sz w:val="20"/>
           <w:lang w:val="en-US"/>
         </w:rPr>
-        <w:t>{{ loop.index }}. {{ pozycja }}</w:t>
+        <w:t xml:space="preserve">{{ </w:t>
+      </w:r>
+      <w:proofErr w:type="spellStart"/>
+      <w:r>
+        <w:rPr>
+          <w:rFonts w:ascii="Bahnschrift SemiBold" w:hAnsi="Bahnschrift SemiBold" w:cs="Arial"/>
+          <w:sz w:val="20"/>
+          <w:lang w:val="en-US"/>
+        </w:rPr>
+        <w:t>loop.index</w:t>
+      </w:r>
+      <w:proofErr w:type="spellEnd"/>
+      <w:r>
+        <w:rPr>
+          <w:rFonts w:ascii="Bahnschrift SemiBold" w:hAnsi="Bahnschrift SemiBold" w:cs="Arial"/>
+          <w:sz w:val="20"/>
+          <w:lang w:val="en-US"/>
+        </w:rPr>
+        <w:t xml:space="preserve"> }}.</w:t>
+        <w:tab/>
+        <w:t xml:space="preserve">{{ </w:t>
+      </w:r>
+      <w:proofErr w:type="spellStart"/>
+      <w:r>
+        <w:rPr>
+          <w:rFonts w:ascii="Bahnschrift SemiBold" w:hAnsi="Bahnschrift SemiBold" w:cs="Arial"/>
+          <w:sz w:val="20"/>
+          <w:lang w:val="en-US"/>
+        </w:rPr>
+        <w:t>pozycja</w:t>
+      </w:r>
+      <w:proofErr w:type="spellEnd"/>
+      <w:r>
+        <w:rPr>
+          <w:rFonts w:ascii="Bahnschrift SemiBold" w:hAnsi="Bahnschrift SemiBold" w:cs="Arial"/>
+          <w:sz w:val="20"/>
+          <w:lang w:val="en-US"/>
+        </w:rPr>
+        <w:t xml:space="preserve"> }}</w:t>
       </w:r>
     </w:p>
     <w:p>
@@ -736,7 +1009,25 @@
           <w:sz w:val="20"/>
           <w:lang w:val="en-US"/>
         </w:rPr>
-        <w:t>{%p endfor %}</w:t>
+        <w:t xml:space="preserve">{%p </w:t>
+      </w:r>
+      <w:proofErr w:type="spellStart"/>
+      <w:r>
+        <w:rPr>
+          <w:rFonts w:ascii="Bahnschrift SemiBold" w:hAnsi="Bahnschrift SemiBold" w:cs="Arial"/>
+          <w:sz w:val="20"/>
+          <w:lang w:val="en-US"/>
+        </w:rPr>
+        <w:t>endfor</w:t>
+      </w:r>
+      <w:proofErr w:type="spellEnd"/>
+      <w:r>
+        <w:rPr>
+          <w:rFonts w:ascii="Bahnschrift SemiBold" w:hAnsi="Bahnschrift SemiBold" w:cs="Arial"/>
+          <w:sz w:val="20"/>
+          <w:lang w:val="en-US"/>
+        </w:rPr>
+        <w:t xml:space="preserve"> %}</w:t>
       </w:r>
     </w:p>
     <w:p>
@@ -823,7 +1114,27 @@
           <w:sz w:val="20"/>
           <w:lang w:val="en-US"/>
         </w:rPr>
-        <w:t>, nr upr. 23266</w:t>
+        <w:t xml:space="preserve">, nr </w:t>
+      </w:r>
+      <w:proofErr w:type="spellStart"/>
+      <w:r>
+        <w:rPr>
+          <w:rFonts w:ascii="Bahnschrift SemiBold" w:hAnsi="Bahnschrift SemiBold" w:cs="Arial"/>
+          <w:b/>
+          <w:sz w:val="20"/>
+          <w:lang w:val="en-US"/>
+        </w:rPr>
+        <w:t>upr</w:t>
+      </w:r>
+      <w:proofErr w:type="spellEnd"/>
+      <w:r>
+        <w:rPr>
+          <w:rFonts w:ascii="Bahnschrift SemiBold" w:hAnsi="Bahnschrift SemiBold" w:cs="Arial"/>
+          <w:b/>
+          <w:sz w:val="20"/>
+          <w:lang w:val="en-US"/>
+        </w:rPr>
+        <w:t>. 23266</w:t>
       </w:r>
     </w:p>
     <w:sectPr>

</xml_diff>

<commit_message>
Podpis przypięty do dołu strony niezależnie od długości spisu
Akapit z podpisem dostaje ramkę `w:framePr` z `vAnchor="margin"` i `yAlign="bottom"`,
czyli natywny mechanizm Worda do przypinania akapitu do dołu obszaru tekstu.
Sprawdzone przy 2 i przy 13 pozycjach spisu: podpis ląduje w tym samym miejscu,
wycinki dolnej części strony są nie do odróżnienia.

Tabulatory wypychające podpis w prawo zostały usunięte — w ramce pozycję ustala
`xAlign`, a tabulatory rozpychałyby ją na całą szerokość strony.

Formatowania tego typu nie da się raz wyklikać w formatce, bo brat przysyła kolejne
wersje pliku. Stąd `narzedzia/popraw_szablon.py`: nakłada tabulator i wcięcie wiszące
w pozycji spisu oraz ramkę podpisu, i jest odporny na powtórzenie. Do puszczenia
po każdej podmianie `.docx`.

Co-Authored-By: Claude Opus 5 <noreply@anthropic.com>
</commit_message>
<xml_diff>
--- a/szablony/spis_tresci_wzor.docx
+++ b/szablony/spis_tresci_wzor.docx
@@ -925,7 +925,6 @@
         <w:pStyle w:val="Bezodstpw"/>
         <w:tabs>
           <w:tab w:val="left" w:pos="510"/>
-          <w:tab w:pos="510" w:val="left"/>
         </w:tabs>
         <w:spacing w:after="120"/>
         <w:ind w:left="510" w:hanging="510"/>
@@ -1050,6 +1049,7 @@
     </w:p>
     <w:p>
       <w:pPr>
+        <w:framePr w:wrap="around" w:vAnchor="margin" w:hAnchor="margin" w:xAlign="right" w:yAlign="bottom"/>
         <w:pStyle w:val="Bezodstpw"/>
         <w:jc w:val="right"/>
         <w:rPr>
@@ -1059,41 +1059,6 @@
           <w:lang w:val="en-US"/>
         </w:rPr>
       </w:pPr>
-      <w:r>
-        <w:rPr>
-          <w:rFonts w:ascii="Bahnschrift SemiBold" w:hAnsi="Bahnschrift SemiBold" w:cs="Arial"/>
-          <w:lang w:val="en-US"/>
-        </w:rPr>
-        <w:tab/>
-      </w:r>
-      <w:r>
-        <w:rPr>
-          <w:rFonts w:ascii="Bahnschrift SemiBold" w:hAnsi="Bahnschrift SemiBold" w:cs="Arial"/>
-          <w:lang w:val="en-US"/>
-        </w:rPr>
-        <w:tab/>
-      </w:r>
-      <w:r>
-        <w:rPr>
-          <w:rFonts w:ascii="Bahnschrift SemiBold" w:hAnsi="Bahnschrift SemiBold" w:cs="Arial"/>
-          <w:lang w:val="en-US"/>
-        </w:rPr>
-        <w:tab/>
-      </w:r>
-      <w:r>
-        <w:rPr>
-          <w:rFonts w:ascii="Bahnschrift SemiBold" w:hAnsi="Bahnschrift SemiBold" w:cs="Arial"/>
-          <w:lang w:val="en-US"/>
-        </w:rPr>
-        <w:tab/>
-      </w:r>
-      <w:r>
-        <w:rPr>
-          <w:rFonts w:ascii="Bahnschrift SemiBold" w:hAnsi="Bahnschrift SemiBold" w:cs="Arial"/>
-          <w:lang w:val="en-US"/>
-        </w:rPr>
-        <w:tab/>
-      </w:r>
       <w:r>
         <w:rPr>
           <w:rFonts w:ascii="Bahnschrift SemiBold" w:hAnsi="Bahnschrift SemiBold" w:cs="Arial"/>

</xml_diff>

<commit_message>
Jeden wiersz mniej pod logo, podpis dwa wiersze wyżej
Z formatki wypada pusty akapit między blokiem logo a „Jedn. ewid.”.

Podpis podnosimy dwoma pustymi akapitami **wewnątrz jego ramki**: kolejne akapity
o identycznym `framePr` należą do tej samej ramki, więc ramka rośnie w dół,
a jej dolna krawędź zostaje przyklejona do marginesu — tekst wędruje w górę.

Pierwsze podejście przez `space_after` na akapicie w ramce nie zadziałało:
LibreOffice nie wlicza odstępu do wysokości ramki i podpis stał w miejscu.
Wyszło to dopiero na wyrenderowanej stronie, nie na wartościach w XML-u.

Sprawdzone przy 2 i przy 13 pozycjach spisu — podpis w obu wypadkach stoi
w tym samym miejscu, dwa wiersze nad kreską stopki.

Co-Authored-By: Claude Opus 5 <noreply@anthropic.com>
</commit_message>
<xml_diff>
--- a/szablony/spis_tresci_wzor.docx
+++ b/szablony/spis_tresci_wzor.docx
@@ -341,17 +341,6 @@
           <w:szCs w:val="16"/>
         </w:rPr>
       </w:pPr>
-    </w:p>
-    <w:p>
-      <w:pPr>
-        <w:pStyle w:val="Bezodstpw"/>
-        <w:jc w:val="right"/>
-        <w:rPr>
-          <w:rFonts w:ascii="Bahnschrift SemiBold" w:eastAsia="Cupertino" w:hAnsi="Bahnschrift SemiBold" w:cs="Arial"/>
-          <w:sz w:val="16"/>
-          <w:szCs w:val="16"/>
-        </w:rPr>
-      </w:pPr>
       <w:r>
         <w:rPr>
           <w:rFonts w:ascii="Bahnschrift SemiBold" w:eastAsia="Cupertino" w:hAnsi="Bahnschrift SemiBold" w:cs="Arial"/>
@@ -1097,6 +1086,36 @@
         </w:rPr>
         <w:t>. 23266</w:t>
       </w:r>
+    </w:p>
+    <w:p>
+      <w:pPr>
+        <w:framePr w:wrap="around" w:vAnchor="margin" w:hAnchor="margin" w:xAlign="right" w:yAlign="bottom"/>
+        <w:pStyle w:val="Bezodstpw"/>
+        <w:jc w:val="right"/>
+        <w:rPr>
+          <w:rFonts w:ascii="Bahnschrift SemiBold" w:hAnsi="Bahnschrift SemiBold" w:cs="Arial"/>
+          <w:b/>
+          <w:sz w:val="20"/>
+          <w:lang w:val="en-US"/>
+        </w:rPr>
+      </w:pPr>
+      <w:proofErr w:type="spellStart"/>
+      <w:proofErr w:type="spellEnd"/>
+    </w:p>
+    <w:p>
+      <w:pPr>
+        <w:framePr w:wrap="around" w:vAnchor="margin" w:hAnchor="margin" w:xAlign="right" w:yAlign="bottom"/>
+        <w:pStyle w:val="Bezodstpw"/>
+        <w:jc w:val="right"/>
+        <w:rPr>
+          <w:rFonts w:ascii="Bahnschrift SemiBold" w:hAnsi="Bahnschrift SemiBold" w:cs="Arial"/>
+          <w:b/>
+          <w:sz w:val="20"/>
+          <w:lang w:val="en-US"/>
+        </w:rPr>
+      </w:pPr>
+      <w:proofErr w:type="spellStart"/>
+      <w:proofErr w:type="spellEnd"/>
     </w:p>
     <w:sectPr>
       <w:headerReference w:type="default" r:id="rId10"/>

</xml_diff>

<commit_message>
Wielka litera w nazwie ulicy w stopce
W pliku adres od początku był zapisany jako „ul. rybnicka 16A”, tylko styl
stopki miał ustawione wersaliki i wszystko wyglądało poprawnie. Zdjęcie
wersalików odsłoniło zapis, jaki naprawdę siedzi w dokumencie.

Poprawione w obu formatkach i we wszystkich trzech stopkach każdej z nich
(pierwsza strona, dalsze, parzyste) — teraz mają tę samą treść, więc rozjazd
między nimi byłby widoczny od razu.

Co-Authored-By: Claude Opus 5 <noreply@anthropic.com>
</commit_message>
<xml_diff>
--- a/szablony/spis_tresci_wzor.docx
+++ b/szablony/spis_tresci_wzor.docx
@@ -1221,6 +1221,7 @@
       <w:footerReference w:type="default" r:id="rId12"/>
       <w:headerReference w:type="first" r:id="rId13"/>
       <w:footerReference w:type="first" r:id="rId14"/>
+      <w:headerReference w:type="even" r:id="rId17"/>
       <w:pgSz w:w="11906" w:h="16838" w:code="9"/>
       <w:pgMar w:top="1383" w:right="1418" w:bottom="1418" w:left="1418" w:header="425" w:footer="223" w:gutter="0"/>
       <w:cols w:space="708"/>
@@ -1270,7 +1271,7 @@
         <w:sz w:val="16"/>
         <w:szCs w:val="16"/>
       </w:rPr>
-      <w:t>ul. rybnicka 16A</w:t>
+      <w:t>ul. Rybnicka 16A</w:t>
     </w:r>
     <w:r>
       <w:rPr>
@@ -1377,7 +1378,7 @@
         <w:sz w:val="16"/>
         <w:szCs w:val="16"/>
       </w:rPr>
-      <w:t>ul. rybnicka 16A</w:t>
+      <w:t>ul. Rybnicka 16A</w:t>
     </w:r>
     <w:r>
       <w:rPr>
@@ -1484,7 +1485,7 @@
         <w:sz w:val="16"/>
         <w:szCs w:val="16"/>
       </w:rPr>
-      <w:t>ul. rybnicka 16A</w:t>
+      <w:t>ul. Rybnicka 16A</w:t>
     </w:r>
     <w:r>
       <w:rPr>
@@ -1621,6 +1622,16 @@
       <w:pBdr>
         <w:bottom w:val="none" w:sz="0" w:space="0" w:color="auto"/>
       </w:pBdr>
+    </w:pPr>
+  </w:p>
+</w:hdr>
+</file>
+
+<file path=word/header3.xml><?xml version="1.0" encoding="utf-8"?>
+<w:hdr xmlns:m="http://schemas.openxmlformats.org/officeDocument/2006/math" xmlns:mc="http://schemas.openxmlformats.org/markup-compatibility/2006" xmlns:mo="http://schemas.microsoft.com/office/mac/office/2008/main" xmlns:mv="urn:schemas-microsoft-com:mac:vml" xmlns:o="urn:schemas-microsoft-com:office:office" xmlns:r="http://schemas.openxmlformats.org/officeDocument/2006/relationships" xmlns:v="urn:schemas-microsoft-com:vml" xmlns:w10="urn:schemas-microsoft-com:office:word" xmlns:w14="http://schemas.microsoft.com/office/word/2010/wordml" xmlns:w="http://schemas.openxmlformats.org/wordprocessingml/2006/main" xmlns:wne="http://schemas.microsoft.com/office/word/2006/wordml" xmlns:wp14="http://schemas.microsoft.com/office/word/2010/wordprocessingDrawing" xmlns:wp="http://schemas.openxmlformats.org/drawingml/2006/wordprocessingDrawing" xmlns:wpc="http://schemas.microsoft.com/office/word/2010/wordprocessingCanvas" xmlns:wpg="http://schemas.microsoft.com/office/word/2010/wordprocessingGroup" xmlns:wpi="http://schemas.microsoft.com/office/word/2010/wordprocessingInk" xmlns:wps="http://schemas.microsoft.com/office/word/2010/wordprocessingShape" mc:Ignorable="w14 wp14">
+  <w:p>
+    <w:pPr>
+      <w:pStyle w:val="Header"/>
     </w:pPr>
   </w:p>
 </w:hdr>

</xml_diff>

<commit_message>
Stopka rozłożona na szerokość strony, także poziomej
Styl stopki miał przystanki tabulatora wpisane na sztywno — 80 mm na środek
i 160 mm do prawej — czyli pod kartkę pionową. Wykaz zmian działki jest poziomy
i ma 248 mm tekstu, więc trzy kolumny danych kończyły się w dwóch trzecich
szerokości, sporo przed kreską. Wyglądało to jak stopka wklejona z innego
dokumentu.

Przystanki liczymy teraz z rozmiaru strony **tego** pliku: środek na połowie
szerokości tekstu, prawy na jej końcu. W dokumentach pionowych wychodzą te same
80 i 160 mm co dotąd, więc nic się w nich nie zmienia.

Ta sama stopka rozchodzi się do wszystkich formatek ze `spis_tresci_wzor.docx`,
ale przystanki muszą zostać przeliczone **po** skopiowaniu — inaczej dokument
poziomy dostawałby ustawienia pionowego wzorca.

Co-Authored-By: Claude Opus 5 <noreply@anthropic.com>
</commit_message>
<xml_diff>
--- a/szablony/spis_tresci_wzor.docx
+++ b/szablony/spis_tresci_wzor.docx
@@ -3114,8 +3114,8 @@
         <w:top w:val="double" w:sz="2" w:space="1" w:color="BFBFBF"/>
       </w:pBdr>
       <w:tabs>
-        <w:tab w:val="center" w:pos="4536"/>
-        <w:tab w:val="right" w:pos="9072"/>
+        <w:tab w:val="center" w:pos="4535"/>
+        <w:tab w:val="right" w:pos="9070"/>
       </w:tabs>
       <w:spacing w:before="120"/>
     </w:pPr>

</xml_diff>